<commit_message>
Gathered and added functional and non-functional requirements
Signed-off-by: tanahia <sofi.bookfan@gmail.com>
</commit_message>
<xml_diff>
--- a/report/Scenario interpretation.docx
+++ b/report/Scenario interpretation.docx
@@ -655,7 +655,23 @@
                 <w:sz w:val="28"/>
                 <w:szCs w:val="28"/>
               </w:rPr>
-              <w:t>Messages or decisions that are made by staff for facility closure and relocation are inconsistent</w:t>
+              <w:t>Messages or decisions that are made by staff for facility closure and relocation</w:t>
+            </w:r>
+            <w:r>
+              <w:rPr>
+                <w:rFonts w:ascii="Times New Roman" w:eastAsia="Times New Roman" w:hAnsi="Times New Roman" w:cs="Times New Roman"/>
+                <w:sz w:val="28"/>
+                <w:szCs w:val="28"/>
+              </w:rPr>
+              <w:t xml:space="preserve"> of bookings</w:t>
+            </w:r>
+            <w:r>
+              <w:rPr>
+                <w:rFonts w:ascii="Times New Roman" w:eastAsia="Times New Roman" w:hAnsi="Times New Roman" w:cs="Times New Roman"/>
+                <w:sz w:val="28"/>
+                <w:szCs w:val="28"/>
+              </w:rPr>
+              <w:t xml:space="preserve"> are inconsistent</w:t>
             </w:r>
             <w:r>
               <w:rPr>
@@ -701,7 +717,41 @@
                 <w:sz w:val="28"/>
                 <w:szCs w:val="28"/>
               </w:rPr>
-              <w:t>receive contradicting information about facility’s closure, relocation and delayed start.</w:t>
+              <w:t xml:space="preserve">receive contradicting information </w:t>
+            </w:r>
+            <w:proofErr w:type="gramStart"/>
+            <w:r>
+              <w:rPr>
+                <w:rFonts w:ascii="Times New Roman" w:eastAsia="Times New Roman" w:hAnsi="Times New Roman" w:cs="Times New Roman"/>
+                <w:sz w:val="28"/>
+                <w:szCs w:val="28"/>
+              </w:rPr>
+              <w:t>about  closure</w:t>
+            </w:r>
+            <w:proofErr w:type="gramEnd"/>
+            <w:r>
+              <w:rPr>
+                <w:rFonts w:ascii="Times New Roman" w:eastAsia="Times New Roman" w:hAnsi="Times New Roman" w:cs="Times New Roman"/>
+                <w:sz w:val="28"/>
+                <w:szCs w:val="28"/>
+              </w:rPr>
+              <w:t>, relocation and delayed start</w:t>
+            </w:r>
+            <w:r>
+              <w:rPr>
+                <w:rFonts w:ascii="Times New Roman" w:eastAsia="Times New Roman" w:hAnsi="Times New Roman" w:cs="Times New Roman"/>
+                <w:sz w:val="28"/>
+                <w:szCs w:val="28"/>
+              </w:rPr>
+              <w:t xml:space="preserve"> of bookings</w:t>
+            </w:r>
+            <w:r>
+              <w:rPr>
+                <w:rFonts w:ascii="Times New Roman" w:eastAsia="Times New Roman" w:hAnsi="Times New Roman" w:cs="Times New Roman"/>
+                <w:sz w:val="28"/>
+                <w:szCs w:val="28"/>
+              </w:rPr>
+              <w:t>.</w:t>
             </w:r>
           </w:p>
         </w:tc>
@@ -2307,7 +2357,23 @@
           <w:sz w:val="28"/>
           <w:szCs w:val="28"/>
         </w:rPr>
-        <w:t>Messages or decisions from staff regarding facility closure, delayed start or relocation communicated c</w:t>
+        <w:t>Messages or decisions from staff regarding closure, delayed start or relocation</w:t>
+      </w:r>
+      <w:r>
+        <w:rPr>
+          <w:rFonts w:ascii="Times New Roman" w:eastAsia="Times New Roman" w:hAnsi="Times New Roman" w:cs="Times New Roman"/>
+          <w:sz w:val="28"/>
+          <w:szCs w:val="28"/>
+        </w:rPr>
+        <w:t xml:space="preserve"> of bookings are</w:t>
+      </w:r>
+      <w:r>
+        <w:rPr>
+          <w:rFonts w:ascii="Times New Roman" w:eastAsia="Times New Roman" w:hAnsi="Times New Roman" w:cs="Times New Roman"/>
+          <w:sz w:val="28"/>
+          <w:szCs w:val="28"/>
+        </w:rPr>
+        <w:t xml:space="preserve"> communicated c</w:t>
       </w:r>
       <w:r>
         <w:rPr>
@@ -2660,8 +2726,6 @@
         <w:pStyle w:val="Heading2"/>
         <w:rPr>
           <w:rFonts w:ascii="Times New Roman" w:eastAsia="Times New Roman" w:hAnsi="Times New Roman" w:cs="Times New Roman"/>
-          <w:sz w:val="28"/>
-          <w:szCs w:val="28"/>
         </w:rPr>
       </w:pPr>
       <w:r>
@@ -3069,7 +3133,23 @@
                 <w:sz w:val="28"/>
                 <w:szCs w:val="28"/>
               </w:rPr>
-              <w:t>Staff distinguish closure, relocation and delayed start but decisions and messages are not always consistent</w:t>
+              <w:t>Staff distinguish closure, relocation and delayed start</w:t>
+            </w:r>
+            <w:r>
+              <w:rPr>
+                <w:rFonts w:ascii="Times New Roman" w:eastAsia="Times New Roman" w:hAnsi="Times New Roman" w:cs="Times New Roman"/>
+                <w:sz w:val="28"/>
+                <w:szCs w:val="28"/>
+              </w:rPr>
+              <w:t xml:space="preserve"> of bookings</w:t>
+            </w:r>
+            <w:r>
+              <w:rPr>
+                <w:rFonts w:ascii="Times New Roman" w:eastAsia="Times New Roman" w:hAnsi="Times New Roman" w:cs="Times New Roman"/>
+                <w:sz w:val="28"/>
+                <w:szCs w:val="28"/>
+              </w:rPr>
+              <w:t xml:space="preserve"> but decisions and messages are not always consistent</w:t>
             </w:r>
             <w:r>
               <w:rPr>
@@ -3244,7 +3324,16 @@
                 <w:sz w:val="28"/>
                 <w:szCs w:val="28"/>
               </w:rPr>
-              <w:t>Partnership programmes and confirmed league fixtures may receive priority, but the basis for priority is not fully documented. A provisional booking may prevent another group from receiving a decision.</w:t>
+              <w:t xml:space="preserve">Partnership programmes and confirmed league fixtures may receive </w:t>
+            </w:r>
+            <w:r>
+              <w:rPr>
+                <w:rFonts w:ascii="Times New Roman" w:eastAsia="Times New Roman" w:hAnsi="Times New Roman" w:cs="Times New Roman"/>
+                <w:sz w:val="28"/>
+                <w:szCs w:val="28"/>
+              </w:rPr>
+              <w:lastRenderedPageBreak/>
+              <w:t>priority, but the basis for priority is not fully documented. A provisional booking may prevent another group from receiving a decision.</w:t>
             </w:r>
           </w:p>
         </w:tc>
@@ -3266,6 +3355,7 @@
                 <w:sz w:val="28"/>
                 <w:szCs w:val="28"/>
               </w:rPr>
+              <w:lastRenderedPageBreak/>
               <w:t xml:space="preserve">A3 – </w:t>
             </w:r>
             <w:r>
@@ -3290,7 +3380,16 @@
                 <w:sz w:val="28"/>
                 <w:szCs w:val="28"/>
               </w:rPr>
-              <w:t>that the basis for priority is not fully documented.</w:t>
+              <w:t xml:space="preserve">that </w:t>
+            </w:r>
+            <w:r>
+              <w:rPr>
+                <w:rFonts w:ascii="Times New Roman" w:eastAsia="Times New Roman" w:hAnsi="Times New Roman" w:cs="Times New Roman"/>
+                <w:sz w:val="28"/>
+                <w:szCs w:val="28"/>
+              </w:rPr>
+              <w:lastRenderedPageBreak/>
+              <w:t>the basis for priority is not fully documented.</w:t>
             </w:r>
           </w:p>
         </w:tc>
@@ -3312,6 +3411,7 @@
                 <w:sz w:val="28"/>
                 <w:szCs w:val="28"/>
               </w:rPr>
+              <w:lastRenderedPageBreak/>
               <w:t>Q3</w:t>
             </w:r>
             <w:r>
@@ -3320,7 +3420,16 @@
                 <w:sz w:val="28"/>
                 <w:szCs w:val="28"/>
               </w:rPr>
-              <w:t xml:space="preserve"> – What is exact priority order between partnership programmes, league fixtures, schools, clubs and casual </w:t>
+              <w:t xml:space="preserve"> – What is exact priority order between partnership programmes, league </w:t>
+            </w:r>
+            <w:r>
+              <w:rPr>
+                <w:rFonts w:ascii="Times New Roman" w:eastAsia="Times New Roman" w:hAnsi="Times New Roman" w:cs="Times New Roman"/>
+                <w:sz w:val="28"/>
+                <w:szCs w:val="28"/>
+              </w:rPr>
+              <w:lastRenderedPageBreak/>
+              <w:t xml:space="preserve">fixtures, schools, clubs and casual </w:t>
             </w:r>
             <w:r>
               <w:rPr>
@@ -3355,6 +3464,7 @@
                 <w:sz w:val="28"/>
                 <w:szCs w:val="28"/>
               </w:rPr>
+              <w:lastRenderedPageBreak/>
               <w:t xml:space="preserve">E4 - </w:t>
             </w:r>
             <w:r>
@@ -3947,7 +4057,16 @@
                 <w:sz w:val="28"/>
                 <w:szCs w:val="28"/>
               </w:rPr>
-              <w:t>Does setup time depend on previous group or next group or layout change between them?</w:t>
+              <w:t xml:space="preserve">Does setup time depend on previous group or </w:t>
+            </w:r>
+            <w:r>
+              <w:rPr>
+                <w:rFonts w:ascii="Times New Roman" w:eastAsia="Times New Roman" w:hAnsi="Times New Roman" w:cs="Times New Roman"/>
+                <w:sz w:val="28"/>
+                <w:szCs w:val="28"/>
+              </w:rPr>
+              <w:lastRenderedPageBreak/>
+              <w:t>next group or layout change between them?</w:t>
             </w:r>
           </w:p>
         </w:tc>
@@ -3974,6 +4093,7 @@
                 <w:sz w:val="28"/>
                 <w:szCs w:val="28"/>
               </w:rPr>
+              <w:lastRenderedPageBreak/>
               <w:t>E</w:t>
             </w:r>
             <w:r>
@@ -4506,7 +4626,16 @@
                 <w:sz w:val="28"/>
                 <w:szCs w:val="28"/>
               </w:rPr>
-              <w:t xml:space="preserve"> A group may accept another pitch or indoor space.</w:t>
+              <w:t xml:space="preserve"> A </w:t>
+            </w:r>
+            <w:r>
+              <w:rPr>
+                <w:rFonts w:ascii="Times New Roman" w:eastAsia="Times New Roman" w:hAnsi="Times New Roman" w:cs="Times New Roman"/>
+                <w:sz w:val="28"/>
+                <w:szCs w:val="28"/>
+              </w:rPr>
+              <w:lastRenderedPageBreak/>
+              <w:t>group may accept another pitch or indoor space.</w:t>
             </w:r>
           </w:p>
           <w:p>
@@ -4537,6 +4666,7 @@
                 <w:sz w:val="28"/>
                 <w:szCs w:val="28"/>
               </w:rPr>
+              <w:lastRenderedPageBreak/>
               <w:t>A</w:t>
             </w:r>
             <w:r>
@@ -4601,7 +4731,16 @@
                 <w:sz w:val="28"/>
                 <w:szCs w:val="28"/>
               </w:rPr>
-              <w:t xml:space="preserve"> by checking documentation that they have by </w:t>
+              <w:t xml:space="preserve"> by checking </w:t>
+            </w:r>
+            <w:r>
+              <w:rPr>
+                <w:rFonts w:ascii="Times New Roman" w:eastAsia="Times New Roman" w:hAnsi="Times New Roman" w:cs="Times New Roman"/>
+                <w:sz w:val="28"/>
+                <w:szCs w:val="28"/>
+              </w:rPr>
+              <w:lastRenderedPageBreak/>
+              <w:t xml:space="preserve">documentation that they have by </w:t>
             </w:r>
             <w:r>
               <w:rPr>
@@ -4647,6 +4786,7 @@
                 <w:sz w:val="28"/>
                 <w:szCs w:val="28"/>
               </w:rPr>
+              <w:lastRenderedPageBreak/>
               <w:t>Q</w:t>
             </w:r>
             <w:r>
@@ -4689,6 +4829,7 @@
                 <w:sz w:val="28"/>
                 <w:szCs w:val="28"/>
               </w:rPr>
+              <w:lastRenderedPageBreak/>
               <w:t>What makes an alternative acceptable?</w:t>
             </w:r>
           </w:p>
@@ -4742,6 +4883,7 @@
                 <w:sz w:val="28"/>
                 <w:szCs w:val="28"/>
               </w:rPr>
+              <w:lastRenderedPageBreak/>
               <w:t>E1</w:t>
             </w:r>
             <w:r>
@@ -5263,31 +5405,19 @@
         <w:rPr>
           <w:rFonts w:ascii="Times New Roman" w:hAnsi="Times New Roman" w:cs="Times New Roman"/>
         </w:rPr>
-        <w:t>The purpose of this system is to give Kerry Community Sports Partnership staff one clear view of facility availability, setup requirements, equipment, changing conditions and conflicting activities, which are currently held in separate calendars, spreadsheets and messages.</w:t>
+        <w:t>The purpose of this system is to give Kerry Community Sports Partnership staff one clear view of facility availability, setup requirements, equipment, changing conditions and conflicting activities, which are currently held in separate calendars, spreadsheets and messages. It supports staff in processing booking requests consistently, recording closures, relocations</w:t>
       </w:r>
       <w:r>
         <w:rPr>
           <w:rFonts w:ascii="Times New Roman" w:hAnsi="Times New Roman" w:cs="Times New Roman"/>
         </w:rPr>
-        <w:t xml:space="preserve"> </w:t>
+        <w:t xml:space="preserve">, </w:t>
       </w:r>
       <w:r>
         <w:rPr>
           <w:rFonts w:ascii="Times New Roman" w:hAnsi="Times New Roman" w:cs="Times New Roman"/>
         </w:rPr>
-        <w:t>It supports staff in processing booking requests consistently, recording closures, relocations and restrictions</w:t>
-      </w:r>
-      <w:r>
-        <w:rPr>
-          <w:rFonts w:ascii="Times New Roman" w:hAnsi="Times New Roman" w:cs="Times New Roman"/>
-        </w:rPr>
-        <w:t xml:space="preserve"> </w:t>
-      </w:r>
-      <w:r>
-        <w:rPr>
-          <w:rFonts w:ascii="Times New Roman" w:hAnsi="Times New Roman" w:cs="Times New Roman"/>
-        </w:rPr>
-        <w:t>and reducing overlapping bookings, so that groups receive clear decisions and the coordinator has reliable records for reporting. Payment, competition administration and live results are outside its purpose.</w:t>
+        <w:t>restrictions and reducing overlapping bookings, so that groups receive clear decisions and the coordinator has reliable records for reporting. Payment, competition administration and live results are outside its purpose.</w:t>
       </w:r>
     </w:p>
     <w:p>
@@ -5517,7 +5647,25 @@
               <w:rPr>
                 <w:rFonts w:ascii="Times New Roman" w:hAnsi="Times New Roman" w:cs="Times New Roman"/>
               </w:rPr>
-              <w:t>messages and decisions made by staff for facility closure and relocation</w:t>
+              <w:t>messages and decisions made by staff for closure</w:t>
+            </w:r>
+            <w:r>
+              <w:rPr>
+                <w:rFonts w:ascii="Times New Roman" w:hAnsi="Times New Roman" w:cs="Times New Roman"/>
+              </w:rPr>
+              <w:t>, delayed start,</w:t>
+            </w:r>
+            <w:r>
+              <w:rPr>
+                <w:rFonts w:ascii="Times New Roman" w:hAnsi="Times New Roman" w:cs="Times New Roman"/>
+              </w:rPr>
+              <w:t xml:space="preserve"> relocation</w:t>
+            </w:r>
+            <w:r>
+              <w:rPr>
+                <w:rFonts w:ascii="Times New Roman" w:hAnsi="Times New Roman" w:cs="Times New Roman"/>
+              </w:rPr>
+              <w:t xml:space="preserve"> of bookings</w:t>
             </w:r>
             <w:r>
               <w:rPr>
@@ -5777,7 +5925,14 @@
               <w:rPr>
                 <w:rFonts w:ascii="Times New Roman" w:hAnsi="Times New Roman" w:cs="Times New Roman"/>
               </w:rPr>
-              <w:t>Some activities require evidence of suitable supervision, insurance or qualified coaching. Regular clubs are familiar to staff, while casual groups may not know what information is required.</w:t>
+              <w:t xml:space="preserve">Some activities require evidence of suitable supervision, insurance or qualified coaching. Regular </w:t>
+            </w:r>
+            <w:r>
+              <w:rPr>
+                <w:rFonts w:ascii="Times New Roman" w:hAnsi="Times New Roman" w:cs="Times New Roman"/>
+              </w:rPr>
+              <w:lastRenderedPageBreak/>
+              <w:t>clubs are familiar to staff, while casual groups may not know what information is required.</w:t>
             </w:r>
           </w:p>
           <w:p>
@@ -5804,6 +5959,7 @@
               <w:rPr>
                 <w:rFonts w:ascii="Times New Roman" w:hAnsi="Times New Roman" w:cs="Times New Roman"/>
               </w:rPr>
+              <w:lastRenderedPageBreak/>
               <w:t>In scope</w:t>
             </w:r>
           </w:p>
@@ -6359,6 +6515,7 @@
               <w:rPr>
                 <w:rFonts w:ascii="Times New Roman" w:hAnsi="Times New Roman" w:cs="Times New Roman"/>
               </w:rPr>
+              <w:lastRenderedPageBreak/>
               <w:t>In scope</w:t>
             </w:r>
           </w:p>
@@ -6950,6 +7107,7 @@
         <w:rPr>
           <w:rFonts w:ascii="Times New Roman" w:hAnsi="Times New Roman" w:cs="Times New Roman"/>
         </w:rPr>
+        <w:lastRenderedPageBreak/>
         <w:t>Boundary table:</w:t>
       </w:r>
     </w:p>
@@ -7633,6 +7791,7 @@
               <w:rPr>
                 <w:rFonts w:ascii="Times New Roman" w:hAnsi="Times New Roman" w:cs="Times New Roman"/>
               </w:rPr>
+              <w:lastRenderedPageBreak/>
               <w:t xml:space="preserve">D3 – </w:t>
             </w:r>
             <w:r>
@@ -7645,7 +7804,19 @@
               <w:rPr>
                 <w:rFonts w:ascii="Times New Roman" w:hAnsi="Times New Roman" w:cs="Times New Roman"/>
               </w:rPr>
-              <w:t>confirm who decides that a space is unavailable or partially available, who approves closures, relocations and delayed starts and who informs affected contacts.</w:t>
+              <w:t>confirm who decides that a space is unavailable or partially available, who approves closures, relocations and delayed starts</w:t>
+            </w:r>
+            <w:r>
+              <w:rPr>
+                <w:rFonts w:ascii="Times New Roman" w:hAnsi="Times New Roman" w:cs="Times New Roman"/>
+              </w:rPr>
+              <w:t xml:space="preserve"> of bookings</w:t>
+            </w:r>
+            <w:r>
+              <w:rPr>
+                <w:rFonts w:ascii="Times New Roman" w:hAnsi="Times New Roman" w:cs="Times New Roman"/>
+              </w:rPr>
+              <w:t xml:space="preserve"> and who informs affected contacts.</w:t>
             </w:r>
           </w:p>
         </w:tc>
@@ -8110,6 +8281,7 @@
               <w:rPr>
                 <w:rFonts w:ascii="Times New Roman" w:hAnsi="Times New Roman" w:cs="Times New Roman"/>
               </w:rPr>
+              <w:lastRenderedPageBreak/>
               <w:t>D10 - Stakeholders related to management of facility confirm who decides whether outdoor facilities are safe and what makes an alternative space suitable.</w:t>
             </w:r>
           </w:p>
@@ -8558,7 +8730,14 @@
               <w:rPr>
                 <w:rFonts w:ascii="Times New Roman" w:hAnsi="Times New Roman" w:cs="Times New Roman"/>
               </w:rPr>
-              <w:t>Closure, relocation and delayed start must be recorded and communicated each as a separate outcome. The scenario doesn’t confirm who may approve these decisions so defining approving rules is out of scope.</w:t>
+              <w:t xml:space="preserve">Closure, relocation and delayed start must be recorded and communicated each as a separate outcome. The scenario doesn’t confirm who may </w:t>
+            </w:r>
+            <w:r>
+              <w:rPr>
+                <w:rFonts w:ascii="Times New Roman" w:hAnsi="Times New Roman" w:cs="Times New Roman"/>
+              </w:rPr>
+              <w:lastRenderedPageBreak/>
+              <w:t>approve these decisions so defining approving rules is out of scope.</w:t>
             </w:r>
           </w:p>
         </w:tc>
@@ -8578,6 +8757,7 @@
               <w:rPr>
                 <w:rFonts w:ascii="Times New Roman" w:hAnsi="Times New Roman" w:cs="Times New Roman"/>
               </w:rPr>
+              <w:lastRenderedPageBreak/>
               <w:t>C5 - The initial scope excludes competition administration and live results.</w:t>
             </w:r>
           </w:p>
@@ -9059,7 +9239,11 @@
               </w:rPr>
             </w:pPr>
             <w:r>
-              <w:t>Have clearer view of availability of facility availability, setup requirements, changing conditions and conflicting activities.</w:t>
+              <w:t xml:space="preserve">Have clearer view of availability of facility availability, setup requirements, changing conditions and </w:t>
+            </w:r>
+            <w:r>
+              <w:lastRenderedPageBreak/>
+              <w:t>conflicting activities.</w:t>
             </w:r>
             <w:r>
               <w:rPr>
@@ -9164,7 +9348,12 @@
               </w:rPr>
             </w:pPr>
             <w:r>
-              <w:t>Records are inconsistent and scattered across in separate calendars, spreadsheets and messages.</w:t>
+              <w:lastRenderedPageBreak/>
+              <w:t xml:space="preserve">Records are inconsistent and scattered across in separate calendars, spreadsheets </w:t>
+            </w:r>
+            <w:r>
+              <w:lastRenderedPageBreak/>
+              <w:t>and messages.</w:t>
             </w:r>
             <w:r>
               <w:rPr>
@@ -9227,6 +9416,7 @@
               <w:rPr>
                 <w:lang w:val="en-US"/>
               </w:rPr>
+              <w:lastRenderedPageBreak/>
               <w:t> </w:t>
             </w:r>
           </w:p>
@@ -9382,7 +9572,11 @@
               </w:rPr>
             </w:pPr>
             <w:r>
-              <w:t>May not know what supervision, insurance or qualified coaching evidence is required and may wait for decision behind a provisional booking.</w:t>
+              <w:t xml:space="preserve">May not know what supervision, insurance or qualified coaching evidence is required and may wait for decision behind a </w:t>
+            </w:r>
+            <w:r>
+              <w:lastRenderedPageBreak/>
+              <w:t>provisional booking.</w:t>
             </w:r>
             <w:r>
               <w:rPr>
@@ -9413,6 +9607,7 @@
               <w:rPr>
                 <w:lang w:val="en-US"/>
               </w:rPr>
+              <w:lastRenderedPageBreak/>
               <w:t> </w:t>
             </w:r>
           </w:p>
@@ -10234,7 +10429,11 @@
               </w:rPr>
             </w:pPr>
             <w:r>
-              <w:t>Access information about confirmed and provisional bookings, utilisation, maintenance conflicts, equipment allocation, incidents and recurring unmet demand.</w:t>
+              <w:t xml:space="preserve">Access information about confirmed and </w:t>
+            </w:r>
+            <w:r>
+              <w:lastRenderedPageBreak/>
+              <w:t>provisional bookings, utilisation, maintenance conflicts, equipment allocation, incidents and recurring unmet demand.</w:t>
             </w:r>
             <w:r>
               <w:rPr>
@@ -10262,7 +10461,12 @@
               </w:rPr>
             </w:pPr>
             <w:r>
-              <w:t>Reports are built by hand from separate calendars, spreadsheets and messages, so they are slow and may be incomplete.</w:t>
+              <w:lastRenderedPageBreak/>
+              <w:t xml:space="preserve">Reports are built by hand from separate calendars, </w:t>
+            </w:r>
+            <w:r>
+              <w:lastRenderedPageBreak/>
+              <w:t>spreadsheets and messages, so they are slow and may be incomplete.</w:t>
             </w:r>
             <w:r>
               <w:rPr>
@@ -10293,6 +10497,7 @@
               <w:rPr>
                 <w:lang w:val="en-US"/>
               </w:rPr>
+              <w:lastRenderedPageBreak/>
               <w:t> </w:t>
             </w:r>
           </w:p>
@@ -10363,6 +10568,7 @@
               <w:rPr>
                 <w:lang w:val="en-US"/>
               </w:rPr>
+              <w:lastRenderedPageBreak/>
               <w:t> </w:t>
             </w:r>
           </w:p>
@@ -10390,6 +10596,7 @@
               </w:rPr>
             </w:pPr>
             <w:r>
+              <w:lastRenderedPageBreak/>
               <w:t>S7 - Finance system</w:t>
             </w:r>
             <w:r>
@@ -11113,7 +11320,11 @@
               </w:rPr>
             </w:pPr>
             <w:r>
-              <w:t>Concerns related to Local communities' organisations are unknown</w:t>
+              <w:t xml:space="preserve">Concerns related to Local </w:t>
+            </w:r>
+            <w:r>
+              <w:lastRenderedPageBreak/>
+              <w:t>communities' organisations are unknown</w:t>
             </w:r>
             <w:r>
               <w:rPr>
@@ -11144,6 +11355,7 @@
               <w:rPr>
                 <w:lang w:val="en-US"/>
               </w:rPr>
+              <w:lastRenderedPageBreak/>
               <w:t> </w:t>
             </w:r>
           </w:p>
@@ -11214,6 +11426,7 @@
               <w:rPr>
                 <w:lang w:val="en-US"/>
               </w:rPr>
+              <w:lastRenderedPageBreak/>
               <w:t> </w:t>
             </w:r>
           </w:p>
@@ -12469,6 +12682,7 @@
         <w:pStyle w:val="Heading2"/>
       </w:pPr>
       <w:r>
+        <w:lastRenderedPageBreak/>
         <w:t>Actor-goal table</w:t>
       </w:r>
       <w:r>
@@ -12665,7 +12879,13 @@
           </w:p>
           <w:p>
             <w:r>
-              <w:t>Record decisions on closure, relocation and delayed start, and inform affected contacts</w:t>
+              <w:t>Record decisions on closure, relocation and delayed start</w:t>
+            </w:r>
+            <w:r>
+              <w:t xml:space="preserve"> of bookings</w:t>
+            </w:r>
+            <w:r>
+              <w:t xml:space="preserve"> and inform affected contacts</w:t>
             </w:r>
             <w:r>
               <w:t>.</w:t>
@@ -12708,7 +12928,6 @@
               </w:rPr>
             </w:pPr>
             <w:r>
-              <w:lastRenderedPageBreak/>
               <w:t>Record cancellations, late arrivals and departures</w:t>
             </w:r>
             <w:r>
@@ -12767,7 +12986,6 @@
               <w:rPr>
                 <w:lang w:val="en-US"/>
               </w:rPr>
-              <w:lastRenderedPageBreak/>
               <w:t> </w:t>
             </w:r>
             <w:r>
@@ -12865,15 +13083,16 @@
               <w:t>Receive a decision on the request and be told of any closure, relocation or delayed start</w:t>
             </w:r>
             <w:r>
+              <w:t xml:space="preserve"> of booking</w:t>
+            </w:r>
+            <w:r>
               <w:t>.</w:t>
             </w:r>
           </w:p>
           <w:p>
             <w:r>
-              <w:t xml:space="preserve">Receive </w:t>
-            </w:r>
-            <w:r>
-              <w:t>extra time for setup before activity and reset after activity.</w:t>
+              <w:lastRenderedPageBreak/>
+              <w:t>Receive extra time for setup before activity and reset after activity.</w:t>
             </w:r>
           </w:p>
           <w:p>
@@ -12919,6 +13138,7 @@
               <w:rPr>
                 <w:lang w:val="en-US"/>
               </w:rPr>
+              <w:lastRenderedPageBreak/>
               <w:t> </w:t>
             </w:r>
             <w:r>
@@ -12992,6 +13212,9 @@
               <w:t>Receive a decision on the request and be told of any closure, relocation or delayed start</w:t>
             </w:r>
             <w:r>
+              <w:t xml:space="preserve"> of booking</w:t>
+            </w:r>
+            <w:r>
               <w:t>.</w:t>
             </w:r>
           </w:p>
@@ -13076,7 +13299,6 @@
               </w:rPr>
             </w:pPr>
             <w:r>
-              <w:lastRenderedPageBreak/>
               <w:t>School</w:t>
             </w:r>
             <w:r>
@@ -13117,6 +13339,9 @@
               <w:t>Receive a decision on the request and be told of any closure, relocation or delayed start</w:t>
             </w:r>
             <w:r>
+              <w:t xml:space="preserve"> of booking</w:t>
+            </w:r>
+            <w:r>
               <w:t>.</w:t>
             </w:r>
           </w:p>
@@ -13127,6 +13352,7 @@
           </w:p>
           <w:p>
             <w:r>
+              <w:lastRenderedPageBreak/>
               <w:t>Accept a suitable alternative when outdoor use is restricted</w:t>
             </w:r>
             <w:r>
@@ -13168,19 +13394,14 @@
               <w:rPr>
                 <w:lang w:val="en-US"/>
               </w:rPr>
-              <w:t> </w:t>
-            </w:r>
-            <w:r>
-              <w:rPr>
-                <w:lang w:val="en-US"/>
-              </w:rPr>
-              <w:t>P6, P7, P2, P3, P10</w:t>
-            </w:r>
-            <w:r>
-              <w:rPr>
-                <w:lang w:val="en-US"/>
-              </w:rPr>
-              <w:t>, P5</w:t>
+              <w:lastRenderedPageBreak/>
+              <w:t> </w:t>
+            </w:r>
+            <w:r>
+              <w:rPr>
+                <w:lang w:val="en-US"/>
+              </w:rPr>
+              <w:t>P6, P7, P2, P3, P10, P5</w:t>
             </w:r>
           </w:p>
         </w:tc>
@@ -13247,6 +13468,9 @@
               <w:t>Receive a decision on the request and be told of any closure, relocation or delayed start</w:t>
             </w:r>
             <w:r>
+              <w:t xml:space="preserve"> of booking</w:t>
+            </w:r>
+            <w:r>
               <w:t>.</w:t>
             </w:r>
           </w:p>
@@ -13365,11 +13589,7 @@
               <w:t> </w:t>
             </w:r>
             <w:r>
-              <w:t xml:space="preserve">Open and close the facility using clear instructions and the required keys or access codes, without seeing </w:t>
-            </w:r>
-            <w:r>
-              <w:lastRenderedPageBreak/>
-              <w:t>information they do not need</w:t>
+              <w:t>Open and close the facility using clear instructions and the required keys or access codes, without seeing information they do not need</w:t>
             </w:r>
             <w:r>
               <w:t>.</w:t>
@@ -13400,7 +13620,6 @@
               <w:rPr>
                 <w:lang w:val="en-US"/>
               </w:rPr>
-              <w:lastRenderedPageBreak/>
               <w:t> </w:t>
             </w:r>
             <w:r>
@@ -13564,6 +13783,7 @@
               </w:rPr>
             </w:pPr>
             <w:r>
+              <w:lastRenderedPageBreak/>
               <w:t>Maintenance officer</w:t>
             </w:r>
             <w:r>
@@ -13829,6 +14049,1785 @@
                 <w:lang w:val="en-US"/>
               </w:rPr>
               <w:t>No related problem.</w:t>
+            </w:r>
+          </w:p>
+        </w:tc>
+      </w:tr>
+    </w:tbl>
+    <w:p/>
+    <w:p>
+      <w:pPr>
+        <w:pStyle w:val="Heading1"/>
+      </w:pPr>
+      <w:r>
+        <w:t>Requirements catalogue</w:t>
+      </w:r>
+      <w:r>
+        <w:t>:</w:t>
+      </w:r>
+    </w:p>
+    <w:p>
+      <w:pPr>
+        <w:pStyle w:val="Heading2"/>
+      </w:pPr>
+      <w:r>
+        <w:t>Functional requirements</w:t>
+      </w:r>
+      <w:r>
+        <w:t>:</w:t>
+      </w:r>
+    </w:p>
+    <w:tbl>
+      <w:tblPr>
+        <w:tblStyle w:val="TableGrid"/>
+        <w:tblW w:w="0" w:type="auto"/>
+        <w:tblLook w:val="04A0" w:firstRow="1" w:lastRow="0" w:firstColumn="1" w:lastColumn="0" w:noHBand="0" w:noVBand="1"/>
+      </w:tblPr>
+      <w:tblGrid>
+        <w:gridCol w:w="2254"/>
+        <w:gridCol w:w="2254"/>
+        <w:gridCol w:w="2254"/>
+        <w:gridCol w:w="2254"/>
+      </w:tblGrid>
+      <w:tr>
+        <w:tc>
+          <w:tcPr>
+            <w:tcW w:w="2254" w:type="dxa"/>
+          </w:tcPr>
+          <w:p>
+            <w:r>
+              <w:t>Requirement</w:t>
+            </w:r>
+          </w:p>
+        </w:tc>
+        <w:tc>
+          <w:tcPr>
+            <w:tcW w:w="2254" w:type="dxa"/>
+          </w:tcPr>
+          <w:p>
+            <w:r>
+              <w:t>Source/Rationale</w:t>
+            </w:r>
+          </w:p>
+        </w:tc>
+        <w:tc>
+          <w:tcPr>
+            <w:tcW w:w="2254" w:type="dxa"/>
+          </w:tcPr>
+          <w:p>
+            <w:proofErr w:type="spellStart"/>
+            <w:r>
+              <w:t>MoSCoW</w:t>
+            </w:r>
+            <w:proofErr w:type="spellEnd"/>
+          </w:p>
+        </w:tc>
+        <w:tc>
+          <w:tcPr>
+            <w:tcW w:w="2254" w:type="dxa"/>
+          </w:tcPr>
+          <w:p>
+            <w:r>
+              <w:t>Verification</w:t>
+            </w:r>
+          </w:p>
+        </w:tc>
+      </w:tr>
+      <w:tr>
+        <w:tc>
+          <w:tcPr>
+            <w:tcW w:w="2254" w:type="dxa"/>
+          </w:tcPr>
+          <w:p>
+            <w:r>
+              <w:t>FR1 - T</w:t>
+            </w:r>
+            <w:r>
+              <w:t>he facility booking arrangements of Kerry Community Sports Partnership</w:t>
+            </w:r>
+            <w:r>
+              <w:t xml:space="preserve"> shall allow staff to record a single space or equipment as unavailable for a date and/or time range with a reason (</w:t>
+            </w:r>
+            <w:r>
+              <w:t>maintenance, inspection or community event</w:t>
+            </w:r>
+            <w:r>
+              <w:t>).</w:t>
+            </w:r>
+          </w:p>
+        </w:tc>
+        <w:tc>
+          <w:tcPr>
+            <w:tcW w:w="2254" w:type="dxa"/>
+          </w:tcPr>
+          <w:p>
+            <w:r>
+              <w:t>P1;</w:t>
+            </w:r>
+          </w:p>
+          <w:p>
+            <w:r>
+              <w:t>Maintenance officer and Facilities coordinator quotes. Avoids closing a whole site.</w:t>
+            </w:r>
+          </w:p>
+        </w:tc>
+        <w:tc>
+          <w:tcPr>
+            <w:tcW w:w="2254" w:type="dxa"/>
+          </w:tcPr>
+          <w:p/>
+          <w:p>
+            <w:r>
+              <w:t>Must</w:t>
+            </w:r>
+          </w:p>
+        </w:tc>
+        <w:tc>
+          <w:tcPr>
+            <w:tcW w:w="2254" w:type="dxa"/>
+          </w:tcPr>
+          <w:p>
+            <w:r>
+              <w:t xml:space="preserve">Walkthrough: </w:t>
+            </w:r>
+            <w:r>
+              <w:t>Record one space as unavailable for a stated date and time range with the reason “maintenance”. Pass if the record shows space,</w:t>
+            </w:r>
+            <w:r>
+              <w:t xml:space="preserve"> </w:t>
+            </w:r>
+            <w:r>
+              <w:t xml:space="preserve">range and </w:t>
+            </w:r>
+            <w:r>
+              <w:t>reason and that</w:t>
+            </w:r>
+            <w:r>
+              <w:t xml:space="preserve"> other spaces can still be booked for the same range</w:t>
+            </w:r>
+            <w:r>
+              <w:t xml:space="preserve"> </w:t>
+            </w:r>
+            <w:r>
+              <w:t>and the restricted space cannot be booked. Repeat</w:t>
+            </w:r>
+            <w:r>
+              <w:t xml:space="preserve"> the process</w:t>
+            </w:r>
+            <w:r>
+              <w:t xml:space="preserve"> with </w:t>
+            </w:r>
+            <w:r>
+              <w:t xml:space="preserve">reason </w:t>
+            </w:r>
+            <w:r>
+              <w:t xml:space="preserve">inspection”, “community event” and </w:t>
+            </w:r>
+            <w:r>
+              <w:t>“equipment unavailable”</w:t>
+            </w:r>
+            <w:r>
+              <w:t>.</w:t>
+            </w:r>
+          </w:p>
+        </w:tc>
+      </w:tr>
+      <w:tr>
+        <w:tc>
+          <w:tcPr>
+            <w:tcW w:w="2254" w:type="dxa"/>
+          </w:tcPr>
+          <w:p>
+            <w:r>
+              <w:t>FR2 - T</w:t>
+            </w:r>
+            <w:r>
+              <w:t>he facility booking arrangements of Kerry Community Sports Partnership</w:t>
+            </w:r>
+            <w:r>
+              <w:t xml:space="preserve"> shall give staff combined view of </w:t>
+            </w:r>
+            <w:r>
+              <w:lastRenderedPageBreak/>
+              <w:t>bookings and unavailable spaces.</w:t>
+            </w:r>
+          </w:p>
+        </w:tc>
+        <w:tc>
+          <w:tcPr>
+            <w:tcW w:w="2254" w:type="dxa"/>
+          </w:tcPr>
+          <w:p>
+            <w:r>
+              <w:lastRenderedPageBreak/>
+              <w:t xml:space="preserve">P1, C2, D2; </w:t>
+            </w:r>
+          </w:p>
+          <w:p>
+            <w:r>
+              <w:t xml:space="preserve">staff need a clearer view of </w:t>
+            </w:r>
+            <w:r>
+              <w:t xml:space="preserve">space </w:t>
+            </w:r>
+            <w:r>
+              <w:t>availability and conflicting activities.</w:t>
+            </w:r>
+          </w:p>
+        </w:tc>
+        <w:tc>
+          <w:tcPr>
+            <w:tcW w:w="2254" w:type="dxa"/>
+          </w:tcPr>
+          <w:p/>
+          <w:p>
+            <w:r>
+              <w:t>Must</w:t>
+            </w:r>
+          </w:p>
+        </w:tc>
+        <w:tc>
+          <w:tcPr>
+            <w:tcW w:w="2254" w:type="dxa"/>
+          </w:tcPr>
+          <w:p>
+            <w:r>
+              <w:t xml:space="preserve">Demonstration: </w:t>
+            </w:r>
+            <w:r>
+              <w:t xml:space="preserve">Prepare sample records for one facility with 3 bookings and 1 restricted space on the same date. </w:t>
+            </w:r>
+            <w:r>
+              <w:rPr>
+                <w:b/>
+                <w:bCs/>
+              </w:rPr>
+              <w:lastRenderedPageBreak/>
+              <w:t>Pass if</w:t>
+            </w:r>
+            <w:r>
+              <w:t xml:space="preserve"> all 4 entries can be seen together without opening a second calendar, spreadsheet or message, and a staff member can say which spaces are free at a chosen time.</w:t>
+            </w:r>
+          </w:p>
+        </w:tc>
+      </w:tr>
+      <w:tr>
+        <w:tc>
+          <w:tcPr>
+            <w:tcW w:w="2254" w:type="dxa"/>
+          </w:tcPr>
+          <w:p>
+            <w:r>
+              <w:t xml:space="preserve">FR3 </w:t>
+            </w:r>
+            <w:r>
+              <w:t>–</w:t>
+            </w:r>
+            <w:r>
+              <w:t xml:space="preserve"> </w:t>
+            </w:r>
+            <w:r>
+              <w:t>W</w:t>
+            </w:r>
+            <w:r>
+              <w:t>hen</w:t>
+            </w:r>
+            <w:r>
+              <w:t xml:space="preserve"> booking </w:t>
+            </w:r>
+            <w:r>
+              <w:t>requests compete for the same space</w:t>
+            </w:r>
+            <w:r>
+              <w:t xml:space="preserve"> t</w:t>
+            </w:r>
+            <w:r>
+              <w:t>he facility booking arrangements of Kerry Community Sports Partnership</w:t>
+            </w:r>
+            <w:r>
+              <w:t xml:space="preserve"> shall</w:t>
+            </w:r>
+            <w:r>
+              <w:t xml:space="preserve"> </w:t>
+            </w:r>
+            <w:r>
+              <w:t>show staff the priority level of each booking request based on the order agreed by facility management</w:t>
+            </w:r>
+            <w:r>
+              <w:t>.</w:t>
+            </w:r>
+          </w:p>
+        </w:tc>
+        <w:tc>
+          <w:tcPr>
+            <w:tcW w:w="2254" w:type="dxa"/>
+          </w:tcPr>
+          <w:p>
+            <w:r>
+              <w:t xml:space="preserve">P3, D4; </w:t>
+            </w:r>
+          </w:p>
+          <w:p>
+            <w:r>
+              <w:t>T</w:t>
+            </w:r>
+            <w:r>
+              <w:t>he basis for priority is not documented, so the organisation must set the order.</w:t>
+            </w:r>
+          </w:p>
+        </w:tc>
+        <w:tc>
+          <w:tcPr>
+            <w:tcW w:w="2254" w:type="dxa"/>
+          </w:tcPr>
+          <w:p/>
+          <w:p>
+            <w:r>
+              <w:t>Must</w:t>
+            </w:r>
+          </w:p>
+        </w:tc>
+        <w:tc>
+          <w:tcPr>
+            <w:tcW w:w="2254" w:type="dxa"/>
+          </w:tcPr>
+          <w:p>
+            <w:r>
+              <w:t xml:space="preserve">Walkthrough: </w:t>
+            </w:r>
+          </w:p>
+          <w:p>
+            <w:r>
+              <w:t xml:space="preserve">Enter 5 competing requests for the same space and time, one each from a partnership programme, a league, a school, a club and a casual group. </w:t>
+            </w:r>
+            <w:r>
+              <w:rPr>
+                <w:b/>
+                <w:bCs/>
+              </w:rPr>
+              <w:t>Pass if</w:t>
+            </w:r>
+            <w:r>
+              <w:t xml:space="preserve"> the priority level shown for each request matches the order agreed by facility management (D4). If no order is agreed yet, record that this cannot be verified</w:t>
+            </w:r>
+            <w:r>
+              <w:t>.</w:t>
+            </w:r>
+          </w:p>
+        </w:tc>
+      </w:tr>
+      <w:tr>
+        <w:tc>
+          <w:tcPr>
+            <w:tcW w:w="2254" w:type="dxa"/>
+          </w:tcPr>
+          <w:p>
+            <w:r>
+              <w:t xml:space="preserve">FR4 - </w:t>
+            </w:r>
+            <w:r>
+              <w:t>T</w:t>
+            </w:r>
+            <w:r>
+              <w:t>he facility booking arrangements of Kerry Community Sports Partnership</w:t>
+            </w:r>
+            <w:r>
+              <w:t xml:space="preserve"> shall record each decision about </w:t>
+            </w:r>
+            <w:r>
+              <w:t>closure, relocation or delayed start</w:t>
+            </w:r>
+            <w:r>
+              <w:t xml:space="preserve"> of</w:t>
+            </w:r>
+            <w:r>
+              <w:t xml:space="preserve"> affected</w:t>
+            </w:r>
+            <w:r>
+              <w:t xml:space="preserve"> </w:t>
+            </w:r>
+            <w:r>
+              <w:t>booking, reason, date and staff member who made it.</w:t>
+            </w:r>
+          </w:p>
+        </w:tc>
+        <w:tc>
+          <w:tcPr>
+            <w:tcW w:w="2254" w:type="dxa"/>
+          </w:tcPr>
+          <w:p>
+            <w:r>
+              <w:t>P2, C4;</w:t>
+            </w:r>
+          </w:p>
+          <w:p>
+            <w:r>
+              <w:t>Staff decisions are inconsistent</w:t>
+            </w:r>
+          </w:p>
+        </w:tc>
+        <w:tc>
+          <w:tcPr>
+            <w:tcW w:w="2254" w:type="dxa"/>
+          </w:tcPr>
+          <w:p/>
+          <w:p>
+            <w:r>
+              <w:t>Must</w:t>
+            </w:r>
+          </w:p>
+        </w:tc>
+        <w:tc>
+          <w:tcPr>
+            <w:tcW w:w="2254" w:type="dxa"/>
+          </w:tcPr>
+          <w:p>
+            <w:r>
+              <w:t>Inspection:</w:t>
+            </w:r>
+          </w:p>
+          <w:p>
+            <w:r>
+              <w:t xml:space="preserve">Record one decision of each type (closure, relocation, delayed start) for a sample booking. </w:t>
+            </w:r>
+            <w:r>
+              <w:rPr>
+                <w:b/>
+                <w:bCs/>
+              </w:rPr>
+              <w:t>Pass if</w:t>
+            </w:r>
+            <w:r>
+              <w:t xml:space="preserve"> each record contains the affected booking, the outcome, reason,</w:t>
+            </w:r>
+            <w:r>
+              <w:t xml:space="preserve"> </w:t>
+            </w:r>
+            <w:r>
+              <w:t>date and name of the staff member who made it.</w:t>
+            </w:r>
+          </w:p>
+        </w:tc>
+      </w:tr>
+      <w:tr>
+        <w:tc>
+          <w:tcPr>
+            <w:tcW w:w="2254" w:type="dxa"/>
+          </w:tcPr>
+          <w:p>
+            <w:r>
+              <w:t xml:space="preserve">FR5 - </w:t>
+            </w:r>
+            <w:r>
+              <w:t>T</w:t>
+            </w:r>
+            <w:r>
+              <w:t xml:space="preserve">he facility booking arrangements of </w:t>
+            </w:r>
+            <w:r>
+              <w:lastRenderedPageBreak/>
+              <w:t>Kerry Community Sports Partnership</w:t>
+            </w:r>
+            <w:r>
+              <w:t xml:space="preserve"> shall</w:t>
+            </w:r>
+            <w:r>
+              <w:t xml:space="preserve"> </w:t>
+            </w:r>
+            <w:r>
+              <w:t>record the message sent to each booking contact affected by a decision</w:t>
+            </w:r>
+            <w:r>
+              <w:t xml:space="preserve"> </w:t>
+            </w:r>
+            <w:r>
+              <w:t>and when it was sent.</w:t>
+            </w:r>
+          </w:p>
+        </w:tc>
+        <w:tc>
+          <w:tcPr>
+            <w:tcW w:w="2254" w:type="dxa"/>
+          </w:tcPr>
+          <w:p>
+            <w:r>
+              <w:lastRenderedPageBreak/>
+              <w:t xml:space="preserve">P2, D3; </w:t>
+            </w:r>
+          </w:p>
+          <w:p>
+            <w:r>
+              <w:t>M</w:t>
+            </w:r>
+            <w:r>
+              <w:t>essages are inconsistent.</w:t>
+            </w:r>
+          </w:p>
+        </w:tc>
+        <w:tc>
+          <w:tcPr>
+            <w:tcW w:w="2254" w:type="dxa"/>
+          </w:tcPr>
+          <w:p/>
+          <w:p>
+            <w:r>
+              <w:t>Should</w:t>
+            </w:r>
+          </w:p>
+        </w:tc>
+        <w:tc>
+          <w:tcPr>
+            <w:tcW w:w="2254" w:type="dxa"/>
+          </w:tcPr>
+          <w:p/>
+        </w:tc>
+      </w:tr>
+      <w:tr>
+        <w:tc>
+          <w:tcPr>
+            <w:tcW w:w="2254" w:type="dxa"/>
+          </w:tcPr>
+          <w:p>
+            <w:r>
+              <w:t>FR6 - T</w:t>
+            </w:r>
+            <w:r>
+              <w:t>he facility booking arrangements of Kerry Community Sports Partnership</w:t>
+            </w:r>
+            <w:r>
+              <w:t xml:space="preserve"> shall r</w:t>
+            </w:r>
+            <w:r>
+              <w:t xml:space="preserve">ecord setup time and reset time separately from the activity time and flag an overlap with another booking </w:t>
+            </w:r>
+            <w:r>
+              <w:t xml:space="preserve">in the </w:t>
+            </w:r>
+            <w:r>
+              <w:t>same space.</w:t>
+            </w:r>
+          </w:p>
+        </w:tc>
+        <w:tc>
+          <w:tcPr>
+            <w:tcW w:w="2254" w:type="dxa"/>
+          </w:tcPr>
+          <w:p>
+            <w:r>
+              <w:t xml:space="preserve">P6, C3, D6; </w:t>
+            </w:r>
+          </w:p>
+          <w:p>
+            <w:r>
+              <w:t>Caretaker quote.</w:t>
+            </w:r>
+          </w:p>
+        </w:tc>
+        <w:tc>
+          <w:tcPr>
+            <w:tcW w:w="2254" w:type="dxa"/>
+          </w:tcPr>
+          <w:p/>
+          <w:p>
+            <w:r>
+              <w:t>Must</w:t>
+            </w:r>
+          </w:p>
+        </w:tc>
+        <w:tc>
+          <w:tcPr>
+            <w:tcW w:w="2254" w:type="dxa"/>
+          </w:tcPr>
+          <w:p>
+            <w:r>
+              <w:t>Walkthrough:</w:t>
+            </w:r>
+          </w:p>
+          <w:p>
+            <w:r>
+              <w:t xml:space="preserve">Create a booking with 30 minutes of setup and 30 minutes of reset, then create a second booking of the same space that starts within the first booking’s reset time. </w:t>
+            </w:r>
+            <w:r>
+              <w:rPr>
+                <w:b/>
+                <w:bCs/>
+              </w:rPr>
+              <w:t>Pass if</w:t>
+            </w:r>
+            <w:r>
+              <w:t xml:space="preserve"> setup and reset times are stored separately from the activity time and overlap is flagged. Then create a third booking that starts after reset time and </w:t>
+            </w:r>
+            <w:r>
+              <w:rPr>
+                <w:b/>
+                <w:bCs/>
+              </w:rPr>
+              <w:t>pass if</w:t>
+            </w:r>
+            <w:r>
+              <w:t xml:space="preserve"> no overlap is flagged.</w:t>
+            </w:r>
+          </w:p>
+        </w:tc>
+      </w:tr>
+      <w:tr>
+        <w:tc>
+          <w:tcPr>
+            <w:tcW w:w="2254" w:type="dxa"/>
+          </w:tcPr>
+          <w:p>
+            <w:r>
+              <w:t>FR7 - T</w:t>
+            </w:r>
+            <w:r>
+              <w:t>he facility booking arrangements of Kerry Community Sports Partnership</w:t>
+            </w:r>
+            <w:r>
+              <w:t xml:space="preserve"> shall </w:t>
+            </w:r>
+            <w:r>
+              <w:t>mark each booking as provisional or confirmed and link the dates of a recurring block.</w:t>
+            </w:r>
+          </w:p>
+        </w:tc>
+        <w:tc>
+          <w:tcPr>
+            <w:tcW w:w="2254" w:type="dxa"/>
+          </w:tcPr>
+          <w:p>
+            <w:r>
+              <w:t xml:space="preserve">P5, D5; </w:t>
+            </w:r>
+          </w:p>
+          <w:p>
+            <w:r>
+              <w:t>S</w:t>
+            </w:r>
+            <w:r>
+              <w:t>chools and leagues request blocks before timetables are final.</w:t>
+            </w:r>
+          </w:p>
+        </w:tc>
+        <w:tc>
+          <w:tcPr>
+            <w:tcW w:w="2254" w:type="dxa"/>
+          </w:tcPr>
+          <w:p/>
+          <w:p>
+            <w:r>
+              <w:t>Must</w:t>
+            </w:r>
+          </w:p>
+        </w:tc>
+        <w:tc>
+          <w:tcPr>
+            <w:tcW w:w="2254" w:type="dxa"/>
+          </w:tcPr>
+          <w:p>
+            <w:r>
+              <w:t>Walkthrough:</w:t>
+            </w:r>
+          </w:p>
+          <w:p>
+            <w:r>
+              <w:t xml:space="preserve">Create a recurring block of 4 dates, mark all 4 as provisional, then confirm one date. </w:t>
+            </w:r>
+            <w:r>
+              <w:rPr>
+                <w:b/>
+                <w:bCs/>
+              </w:rPr>
+              <w:t>Pass if</w:t>
+            </w:r>
+            <w:r>
+              <w:t xml:space="preserve"> the 4 dates are linked, the confirmed date shows as confirmed, the other 3 stay provisional, and each date shows its own status.</w:t>
+            </w:r>
+          </w:p>
+        </w:tc>
+      </w:tr>
+      <w:tr>
+        <w:tc>
+          <w:tcPr>
+            <w:tcW w:w="2254" w:type="dxa"/>
+          </w:tcPr>
+          <w:p>
+            <w:r>
+              <w:t>FR8 - T</w:t>
+            </w:r>
+            <w:r>
+              <w:t xml:space="preserve">he facility booking arrangements of </w:t>
+            </w:r>
+            <w:r>
+              <w:lastRenderedPageBreak/>
+              <w:t>Kerry Community Sports Partnership</w:t>
+            </w:r>
+            <w:r>
+              <w:t xml:space="preserve"> shall r</w:t>
+            </w:r>
+            <w:r>
+              <w:t>ecord</w:t>
+            </w:r>
+            <w:r>
+              <w:t xml:space="preserve"> </w:t>
+            </w:r>
+            <w:r>
+              <w:t>location, repair status and reservations of each shared equipment item and show them to staff when equipment is requested.</w:t>
+            </w:r>
+          </w:p>
+        </w:tc>
+        <w:tc>
+          <w:tcPr>
+            <w:tcW w:w="2254" w:type="dxa"/>
+          </w:tcPr>
+          <w:p>
+            <w:r>
+              <w:lastRenderedPageBreak/>
+              <w:t xml:space="preserve">P7, D7; </w:t>
+            </w:r>
+          </w:p>
+          <w:p>
+            <w:r>
+              <w:t>E</w:t>
+            </w:r>
+            <w:r>
+              <w:t xml:space="preserve">quipment can be at another site, </w:t>
+            </w:r>
+            <w:r>
+              <w:lastRenderedPageBreak/>
+              <w:t>under repair or reserved.</w:t>
+            </w:r>
+          </w:p>
+        </w:tc>
+        <w:tc>
+          <w:tcPr>
+            <w:tcW w:w="2254" w:type="dxa"/>
+          </w:tcPr>
+          <w:p/>
+          <w:p>
+            <w:r>
+              <w:t>Must</w:t>
+            </w:r>
+          </w:p>
+        </w:tc>
+        <w:tc>
+          <w:tcPr>
+            <w:tcW w:w="2254" w:type="dxa"/>
+          </w:tcPr>
+          <w:p>
+            <w:r>
+              <w:t>Inspection:</w:t>
+            </w:r>
+          </w:p>
+          <w:p>
+            <w:r>
+              <w:t xml:space="preserve">Set up 3 equipment items: one stored </w:t>
+            </w:r>
+            <w:r>
+              <w:lastRenderedPageBreak/>
+              <w:t xml:space="preserve">at another site, one under repair and one reserved for another activity. Request each with a booking. </w:t>
+            </w:r>
+            <w:r>
+              <w:rPr>
+                <w:b/>
+                <w:bCs/>
+              </w:rPr>
+              <w:t>Pass if</w:t>
+            </w:r>
+            <w:r>
+              <w:t xml:space="preserve"> staff </w:t>
+            </w:r>
+            <w:r>
+              <w:t xml:space="preserve">can </w:t>
+            </w:r>
+            <w:r>
+              <w:t xml:space="preserve">see the location, repair status and reservation of each </w:t>
+            </w:r>
+            <w:r>
+              <w:t xml:space="preserve">requested equipment </w:t>
+            </w:r>
+            <w:r>
+              <w:t>and the unavailable items are not shown as available.</w:t>
+            </w:r>
+          </w:p>
+        </w:tc>
+      </w:tr>
+      <w:tr>
+        <w:tc>
+          <w:tcPr>
+            <w:tcW w:w="2254" w:type="dxa"/>
+          </w:tcPr>
+          <w:p>
+            <w:r>
+              <w:t>FR9 - T</w:t>
+            </w:r>
+            <w:r>
+              <w:t>he facility booking arrangements of Kerry Community Sports Partnership</w:t>
+            </w:r>
+            <w:r>
+              <w:t xml:space="preserve"> shall </w:t>
+            </w:r>
+            <w:r>
+              <w:t>give relief staff the opening and closing instructions</w:t>
+            </w:r>
+            <w:r>
+              <w:t xml:space="preserve">, access codes and key </w:t>
+            </w:r>
+            <w:r>
+              <w:t>for a booked</w:t>
+            </w:r>
+            <w:r>
+              <w:t xml:space="preserve"> space of facility while not giving out unnecessary information about booking.</w:t>
+            </w:r>
+          </w:p>
+        </w:tc>
+        <w:tc>
+          <w:tcPr>
+            <w:tcW w:w="2254" w:type="dxa"/>
+          </w:tcPr>
+          <w:p>
+            <w:r>
+              <w:t xml:space="preserve">P8a, P8b, D8; </w:t>
+            </w:r>
+          </w:p>
+          <w:p>
+            <w:r>
+              <w:t>R</w:t>
+            </w:r>
+            <w:r>
+              <w:t>elief staff need instructions</w:t>
+            </w:r>
+            <w:r>
+              <w:t>. access codes and keys</w:t>
+            </w:r>
+            <w:r>
+              <w:t xml:space="preserve"> but </w:t>
+            </w:r>
+            <w:r>
+              <w:t xml:space="preserve">they should not have access to </w:t>
+            </w:r>
+            <w:r>
+              <w:t>organisational or payment information.</w:t>
+            </w:r>
+          </w:p>
+        </w:tc>
+        <w:tc>
+          <w:tcPr>
+            <w:tcW w:w="2254" w:type="dxa"/>
+          </w:tcPr>
+          <w:p/>
+          <w:p>
+            <w:r>
+              <w:t>Must</w:t>
+            </w:r>
+          </w:p>
+        </w:tc>
+        <w:tc>
+          <w:tcPr>
+            <w:tcW w:w="2254" w:type="dxa"/>
+          </w:tcPr>
+          <w:p>
+            <w:r>
+              <w:t>Inspection:</w:t>
+            </w:r>
+          </w:p>
+          <w:p>
+            <w:r>
+              <w:t xml:space="preserve">Take 3 sample bookings where the person opening differs from the booking contact. Check what </w:t>
+            </w:r>
+            <w:r>
+              <w:t xml:space="preserve">information </w:t>
+            </w:r>
+            <w:r>
+              <w:t>relief staff receive for each</w:t>
+            </w:r>
+            <w:r>
+              <w:t xml:space="preserve"> booking</w:t>
+            </w:r>
+            <w:r>
+              <w:t xml:space="preserve">. </w:t>
+            </w:r>
+            <w:r>
+              <w:rPr>
+                <w:b/>
+                <w:bCs/>
+              </w:rPr>
+              <w:t>Pass if</w:t>
+            </w:r>
+            <w:r>
+              <w:t xml:space="preserve"> it contains the opening and closing instructions, the access code or key arrangements, and none of the payment information or organisational details listed as sensitive by facility management</w:t>
+            </w:r>
+            <w:r>
+              <w:t>.</w:t>
+            </w:r>
+          </w:p>
+        </w:tc>
+      </w:tr>
+      <w:tr>
+        <w:tc>
+          <w:tcPr>
+            <w:tcW w:w="2254" w:type="dxa"/>
+          </w:tcPr>
+          <w:p>
+            <w:r>
+              <w:t>FR10 - T</w:t>
+            </w:r>
+            <w:r>
+              <w:t>he facility booking arrangements of Kerry Community Sports Partnership</w:t>
+            </w:r>
+            <w:r>
+              <w:t xml:space="preserve"> shall r</w:t>
+            </w:r>
+            <w:r>
+              <w:t xml:space="preserve">ecord each cancellation, late arrival or departure, incident </w:t>
+            </w:r>
+            <w:r>
+              <w:lastRenderedPageBreak/>
+              <w:t>and damage against the group involved</w:t>
+            </w:r>
+            <w:r>
+              <w:t xml:space="preserve"> </w:t>
+            </w:r>
+            <w:r>
+              <w:t>and show this history to staff when they handle a new request from that group.</w:t>
+            </w:r>
+          </w:p>
+        </w:tc>
+        <w:tc>
+          <w:tcPr>
+            <w:tcW w:w="2254" w:type="dxa"/>
+          </w:tcPr>
+          <w:p>
+            <w:r>
+              <w:lastRenderedPageBreak/>
+              <w:t xml:space="preserve">P9, D9; </w:t>
+            </w:r>
+          </w:p>
+          <w:p>
+            <w:r>
+              <w:t>R</w:t>
+            </w:r>
+            <w:r>
+              <w:t>eporting is inconsistent, so there is no shared history.</w:t>
+            </w:r>
+          </w:p>
+        </w:tc>
+        <w:tc>
+          <w:tcPr>
+            <w:tcW w:w="2254" w:type="dxa"/>
+          </w:tcPr>
+          <w:p/>
+          <w:p>
+            <w:r>
+              <w:t>Should</w:t>
+            </w:r>
+          </w:p>
+        </w:tc>
+        <w:tc>
+          <w:tcPr>
+            <w:tcW w:w="2254" w:type="dxa"/>
+          </w:tcPr>
+          <w:p>
+            <w:r>
+              <w:t>Walkthrough:</w:t>
+            </w:r>
+          </w:p>
+          <w:p>
+            <w:r>
+              <w:t>For one group, record</w:t>
+            </w:r>
+            <w:r>
+              <w:t xml:space="preserve"> a </w:t>
+            </w:r>
+            <w:r>
+              <w:t>cancellation, late arrival, late departure</w:t>
+            </w:r>
+            <w:r>
+              <w:t xml:space="preserve">, </w:t>
+            </w:r>
+            <w:r>
+              <w:t>incident and damage</w:t>
+            </w:r>
+            <w:r>
+              <w:t xml:space="preserve"> left</w:t>
+            </w:r>
+            <w:r>
+              <w:t xml:space="preserve">. Then </w:t>
+            </w:r>
+            <w:r>
+              <w:t>create new booking request</w:t>
+            </w:r>
+            <w:r>
+              <w:t xml:space="preserve"> </w:t>
+            </w:r>
+            <w:r>
+              <w:t xml:space="preserve">for </w:t>
+            </w:r>
+            <w:r>
+              <w:lastRenderedPageBreak/>
+              <w:t xml:space="preserve">the same group and one </w:t>
+            </w:r>
+            <w:r>
+              <w:t>for</w:t>
+            </w:r>
+            <w:r>
+              <w:t xml:space="preserve"> a different group. </w:t>
+            </w:r>
+            <w:r>
+              <w:rPr>
+                <w:b/>
+                <w:bCs/>
+              </w:rPr>
+              <w:t>Pass if</w:t>
+            </w:r>
+            <w:r>
+              <w:t xml:space="preserve"> all 5 events appear against the first group when its new request is handled with date and description</w:t>
+            </w:r>
+            <w:r>
+              <w:t xml:space="preserve"> </w:t>
+            </w:r>
+            <w:r>
+              <w:t>and none appear for the second group.</w:t>
+            </w:r>
+          </w:p>
+        </w:tc>
+      </w:tr>
+      <w:tr>
+        <w:tc>
+          <w:tcPr>
+            <w:tcW w:w="2254" w:type="dxa"/>
+          </w:tcPr>
+          <w:p>
+            <w:r>
+              <w:t>FR11 - T</w:t>
+            </w:r>
+            <w:r>
+              <w:t>he facility booking arrangements of Kerry Community Sports Partnership</w:t>
+            </w:r>
+            <w:r>
+              <w:t xml:space="preserve"> shall </w:t>
+            </w:r>
+            <w:r>
+              <w:t>list the spaces recorded as suitable alternatives</w:t>
+            </w:r>
+            <w:r>
+              <w:t xml:space="preserve"> </w:t>
+            </w:r>
+            <w:r>
+              <w:t>with their equipment and lighting details, when staff mark an outdoor space as restricted.</w:t>
+            </w:r>
+          </w:p>
+        </w:tc>
+        <w:tc>
+          <w:tcPr>
+            <w:tcW w:w="2254" w:type="dxa"/>
+          </w:tcPr>
+          <w:p>
+            <w:r>
+              <w:t>P10, D10</w:t>
+            </w:r>
+            <w:r>
+              <w:t>;</w:t>
+            </w:r>
+          </w:p>
+          <w:p>
+            <w:r>
+              <w:t>Coach’s quote.</w:t>
+            </w:r>
+          </w:p>
+        </w:tc>
+        <w:tc>
+          <w:tcPr>
+            <w:tcW w:w="2254" w:type="dxa"/>
+          </w:tcPr>
+          <w:p/>
+          <w:p>
+            <w:r>
+              <w:t>Should</w:t>
+            </w:r>
+          </w:p>
+        </w:tc>
+        <w:tc>
+          <w:tcPr>
+            <w:tcW w:w="2254" w:type="dxa"/>
+          </w:tcPr>
+          <w:p>
+            <w:r>
+              <w:t>Walkthrough:</w:t>
+            </w:r>
+          </w:p>
+          <w:p>
+            <w:r>
+              <w:t>Mark an outdoor pitch as restricted for a stated date, with 2 alternatives recorded for it</w:t>
+            </w:r>
+            <w:r>
+              <w:t xml:space="preserve">. </w:t>
+            </w:r>
+            <w:r>
+              <w:rPr>
+                <w:b/>
+                <w:bCs/>
+              </w:rPr>
+              <w:t>Pass if</w:t>
+            </w:r>
+            <w:r>
+              <w:t xml:space="preserve"> both alternatives are listed with their equipment and lighting details and a space with no recorded details is shown as incomplete,</w:t>
+            </w:r>
+          </w:p>
+        </w:tc>
+      </w:tr>
+      <w:tr>
+        <w:tc>
+          <w:tcPr>
+            <w:tcW w:w="2254" w:type="dxa"/>
+          </w:tcPr>
+          <w:p>
+            <w:r>
+              <w:t>FR12 - T</w:t>
+            </w:r>
+            <w:r>
+              <w:t>he facility booking arrangements of Kerry Community Sports Partnership</w:t>
+            </w:r>
+            <w:r>
+              <w:t xml:space="preserve"> shall </w:t>
+            </w:r>
+            <w:r>
+              <w:t>organise records of confirmed and provisional bookings, maintenance conflicts, equipment allocation</w:t>
+            </w:r>
+            <w:r>
+              <w:t>,</w:t>
+            </w:r>
+            <w:r>
+              <w:t xml:space="preserve"> incidents</w:t>
+            </w:r>
+            <w:r>
+              <w:t xml:space="preserve"> and recurring unmet demand</w:t>
+            </w:r>
+            <w:r>
+              <w:t xml:space="preserve">, so that the coordinator can find the information </w:t>
+            </w:r>
+            <w:r>
+              <w:lastRenderedPageBreak/>
+              <w:t xml:space="preserve">needed for a report in one place. </w:t>
+            </w:r>
+          </w:p>
+        </w:tc>
+        <w:tc>
+          <w:tcPr>
+            <w:tcW w:w="2254" w:type="dxa"/>
+          </w:tcPr>
+          <w:p>
+            <w:r>
+              <w:lastRenderedPageBreak/>
+              <w:t xml:space="preserve">P11, D11; </w:t>
+            </w:r>
+          </w:p>
+          <w:p>
+            <w:r>
+              <w:t>C</w:t>
+            </w:r>
+            <w:r>
+              <w:t>oordinator currently collects this information by hand from separate calendars, spreadsheets and messages.</w:t>
+            </w:r>
+          </w:p>
+        </w:tc>
+        <w:tc>
+          <w:tcPr>
+            <w:tcW w:w="2254" w:type="dxa"/>
+          </w:tcPr>
+          <w:p/>
+          <w:p>
+            <w:r>
+              <w:t>Should</w:t>
+            </w:r>
+          </w:p>
+        </w:tc>
+        <w:tc>
+          <w:tcPr>
+            <w:tcW w:w="2254" w:type="dxa"/>
+          </w:tcPr>
+          <w:p>
+            <w:r>
+              <w:t>Collaboration with the coordinator:</w:t>
+            </w:r>
+          </w:p>
+          <w:p>
+            <w:r>
+              <w:t xml:space="preserve">Prepare sample records for one month. Ask the coordinator to find the confirmed and provisional bookings, maintenance conflicts, equipment allocation and incidents. </w:t>
+            </w:r>
+            <w:r>
+              <w:rPr>
+                <w:b/>
+                <w:bCs/>
+              </w:rPr>
+              <w:t>Pass if</w:t>
+            </w:r>
+            <w:r>
+              <w:t xml:space="preserve"> the coordinator finds all of them using only the organised records, without searching separate </w:t>
+            </w:r>
+            <w:r>
+              <w:lastRenderedPageBreak/>
+              <w:t>calendars, spreadsheets or messages and the numbers match a manual count of the same sample.</w:t>
+            </w:r>
+          </w:p>
+        </w:tc>
+      </w:tr>
+    </w:tbl>
+    <w:p/>
+    <w:p>
+      <w:pPr>
+        <w:pStyle w:val="Heading2"/>
+      </w:pPr>
+      <w:r>
+        <w:t>Non-functional requirements:</w:t>
+      </w:r>
+    </w:p>
+    <w:tbl>
+      <w:tblPr>
+        <w:tblStyle w:val="TableGrid"/>
+        <w:tblW w:w="0" w:type="auto"/>
+        <w:tblLook w:val="04A0" w:firstRow="1" w:lastRow="0" w:firstColumn="1" w:lastColumn="0" w:noHBand="0" w:noVBand="1"/>
+      </w:tblPr>
+      <w:tblGrid>
+        <w:gridCol w:w="2254"/>
+        <w:gridCol w:w="2254"/>
+        <w:gridCol w:w="2254"/>
+        <w:gridCol w:w="2254"/>
+      </w:tblGrid>
+      <w:tr>
+        <w:tc>
+          <w:tcPr>
+            <w:tcW w:w="2254" w:type="dxa"/>
+          </w:tcPr>
+          <w:p>
+            <w:r>
+              <w:t>Requirement</w:t>
+            </w:r>
+          </w:p>
+        </w:tc>
+        <w:tc>
+          <w:tcPr>
+            <w:tcW w:w="2254" w:type="dxa"/>
+          </w:tcPr>
+          <w:p>
+            <w:r>
+              <w:t>Source/Rationale</w:t>
+            </w:r>
+          </w:p>
+        </w:tc>
+        <w:tc>
+          <w:tcPr>
+            <w:tcW w:w="2254" w:type="dxa"/>
+          </w:tcPr>
+          <w:p>
+            <w:proofErr w:type="spellStart"/>
+            <w:r>
+              <w:t>MoSCoW</w:t>
+            </w:r>
+            <w:proofErr w:type="spellEnd"/>
+          </w:p>
+        </w:tc>
+        <w:tc>
+          <w:tcPr>
+            <w:tcW w:w="2254" w:type="dxa"/>
+          </w:tcPr>
+          <w:p>
+            <w:r>
+              <w:t>Verification</w:t>
+            </w:r>
+          </w:p>
+        </w:tc>
+      </w:tr>
+      <w:tr>
+        <w:tc>
+          <w:tcPr>
+            <w:tcW w:w="2254" w:type="dxa"/>
+          </w:tcPr>
+          <w:p>
+            <w:r>
+              <w:t xml:space="preserve">NFR1 - </w:t>
+            </w:r>
+            <w:r>
+              <w:t xml:space="preserve">A staff member shall be able to find the availability of any space for a given date within </w:t>
+            </w:r>
+            <w:r>
+              <w:t xml:space="preserve">5 </w:t>
+            </w:r>
+            <w:r>
+              <w:t>minutes</w:t>
+            </w:r>
+            <w:r>
+              <w:t xml:space="preserve"> </w:t>
+            </w:r>
+            <w:r>
+              <w:t>(A)</w:t>
+            </w:r>
+            <w:r>
+              <w:t>.</w:t>
+            </w:r>
+          </w:p>
+        </w:tc>
+        <w:tc>
+          <w:tcPr>
+            <w:tcW w:w="2254" w:type="dxa"/>
+          </w:tcPr>
+          <w:tbl>
+            <w:tblPr>
+              <w:tblW w:w="0" w:type="auto"/>
+              <w:tblCellSpacing w:w="15" w:type="dxa"/>
+              <w:tblCellMar>
+                <w:top w:w="15" w:type="dxa"/>
+                <w:left w:w="15" w:type="dxa"/>
+                <w:bottom w:w="15" w:type="dxa"/>
+                <w:right w:w="15" w:type="dxa"/>
+              </w:tblCellMar>
+              <w:tblLook w:val="04A0" w:firstRow="1" w:lastRow="0" w:firstColumn="1" w:lastColumn="0" w:noHBand="0" w:noVBand="1"/>
+            </w:tblPr>
+            <w:tblGrid>
+              <w:gridCol w:w="1957"/>
+              <w:gridCol w:w="81"/>
+            </w:tblGrid>
+            <w:tr>
+              <w:trPr>
+                <w:tblCellSpacing w:w="15" w:type="dxa"/>
+              </w:trPr>
+              <w:tc>
+                <w:tcPr>
+                  <w:tcW w:w="0" w:type="auto"/>
+                  <w:vAlign w:val="center"/>
+                  <w:hideMark/>
+                </w:tcPr>
+                <w:p>
+                  <w:pPr>
+                    <w:spacing w:after="0" w:line="240" w:lineRule="auto"/>
+                    <w:rPr>
+                      <w:rFonts w:ascii="Times New Roman" w:eastAsia="Times New Roman" w:hAnsi="Times New Roman" w:cs="Times New Roman"/>
+                      <w:lang w:val="en-US" w:eastAsia="en-US"/>
+                    </w:rPr>
+                  </w:pPr>
+                  <w:r>
+                    <w:rPr>
+                      <w:rFonts w:ascii="Times New Roman" w:eastAsia="Times New Roman" w:hAnsi="Times New Roman" w:cs="Times New Roman"/>
+                      <w:lang w:val="en-US" w:eastAsia="en-US"/>
+                    </w:rPr>
+                    <w:t>P1, C2;</w:t>
+                  </w:r>
+                </w:p>
+                <w:p>
+                  <w:pPr>
+                    <w:spacing w:after="0" w:line="240" w:lineRule="auto"/>
+                    <w:rPr>
+                      <w:rFonts w:ascii="Times New Roman" w:eastAsia="Times New Roman" w:hAnsi="Times New Roman" w:cs="Times New Roman"/>
+                      <w:lang w:val="en-US" w:eastAsia="en-US"/>
+                    </w:rPr>
+                  </w:pPr>
+                  <w:r>
+                    <w:rPr>
+                      <w:rFonts w:ascii="Times New Roman" w:eastAsia="Times New Roman" w:hAnsi="Times New Roman" w:cs="Times New Roman"/>
+                      <w:lang w:val="en-US" w:eastAsia="en-US"/>
+                    </w:rPr>
+                    <w:t>R</w:t>
+                  </w:r>
+                  <w:r>
+                    <w:rPr>
+                      <w:rFonts w:ascii="Times New Roman" w:eastAsia="Times New Roman" w:hAnsi="Times New Roman" w:cs="Times New Roman"/>
+                      <w:lang w:val="en-US" w:eastAsia="en-US"/>
+                    </w:rPr>
+                    <w:t>ecords are currently scattered across calendars, spreadsheets and messages.</w:t>
+                  </w:r>
+                </w:p>
+              </w:tc>
+              <w:tc>
+                <w:tcPr>
+                  <w:tcW w:w="0" w:type="auto"/>
+                  <w:vAlign w:val="center"/>
+                  <w:hideMark/>
+                </w:tcPr>
+                <w:p>
+                  <w:pPr>
+                    <w:spacing w:after="0" w:line="240" w:lineRule="auto"/>
+                    <w:rPr>
+                      <w:rFonts w:ascii="Times New Roman" w:eastAsia="Times New Roman" w:hAnsi="Times New Roman" w:cs="Times New Roman"/>
+                      <w:lang w:val="en-US" w:eastAsia="en-US"/>
+                    </w:rPr>
+                  </w:pPr>
+                </w:p>
+              </w:tc>
+            </w:tr>
+          </w:tbl>
+          <w:p/>
+        </w:tc>
+        <w:tc>
+          <w:tcPr>
+            <w:tcW w:w="2254" w:type="dxa"/>
+          </w:tcPr>
+          <w:p/>
+          <w:p>
+            <w:r>
+              <w:t>Must</w:t>
+            </w:r>
+          </w:p>
+        </w:tc>
+        <w:tc>
+          <w:tcPr>
+            <w:tcW w:w="2254" w:type="dxa"/>
+          </w:tcPr>
+          <w:p>
+            <w:r>
+              <w:t>Timed test:</w:t>
+            </w:r>
+          </w:p>
+          <w:p>
+            <w:r>
+              <w:t>Prepare sample records</w:t>
+            </w:r>
+            <w:r>
+              <w:t xml:space="preserve"> of confirmed provisional, recurring bookings and restricted spaces. </w:t>
+            </w:r>
+            <w:r>
+              <w:t xml:space="preserve">Ask 3 or more different staff members to each find the availability of </w:t>
+            </w:r>
+            <w:r>
+              <w:t>5</w:t>
+            </w:r>
+            <w:r>
+              <w:t xml:space="preserve"> chosen spaces on 5 chosen dates, using only the combined records. Start the clock when the question is given and stop it when the answer is stated. </w:t>
+            </w:r>
+            <w:r>
+              <w:rPr>
+                <w:b/>
+                <w:bCs/>
+              </w:rPr>
+              <w:t>Pass if</w:t>
+            </w:r>
+            <w:r>
+              <w:t xml:space="preserve"> every lookup takes 5 minutes or less and every answer matches the sample records. A wrong answer counts as a failure, even if it was quick.</w:t>
+            </w:r>
+          </w:p>
+        </w:tc>
+      </w:tr>
+      <w:tr>
+        <w:tc>
+          <w:tcPr>
+            <w:tcW w:w="2254" w:type="dxa"/>
+          </w:tcPr>
+          <w:p>
+            <w:r>
+              <w:t xml:space="preserve">NFR2 – A change in space or equipment availability </w:t>
+            </w:r>
+            <w:r>
+              <w:t>s</w:t>
+            </w:r>
+            <w:r>
+              <w:t>hall be visible to all staff within 1 working hour</w:t>
+            </w:r>
+            <w:r>
+              <w:t xml:space="preserve"> </w:t>
+            </w:r>
+            <w:r>
+              <w:t>(A)</w:t>
+            </w:r>
+            <w:r>
+              <w:t>.</w:t>
+            </w:r>
+          </w:p>
+        </w:tc>
+        <w:tc>
+          <w:tcPr>
+            <w:tcW w:w="2254" w:type="dxa"/>
+          </w:tcPr>
+          <w:p>
+            <w:r>
+              <w:t xml:space="preserve">P1, P7; </w:t>
+            </w:r>
+          </w:p>
+          <w:p>
+            <w:r>
+              <w:t>S</w:t>
+            </w:r>
+            <w:r>
+              <w:t>taff must not accept bookings based on outdated information.</w:t>
+            </w:r>
+          </w:p>
+          <w:p/>
+          <w:p/>
+        </w:tc>
+        <w:tc>
+          <w:tcPr>
+            <w:tcW w:w="2254" w:type="dxa"/>
+          </w:tcPr>
+          <w:p/>
+          <w:p>
+            <w:r>
+              <w:t>Must</w:t>
+            </w:r>
+          </w:p>
+        </w:tc>
+        <w:tc>
+          <w:tcPr>
+            <w:tcW w:w="2254" w:type="dxa"/>
+          </w:tcPr>
+          <w:p>
+            <w:r>
+              <w:t>Timed test:</w:t>
+            </w:r>
+          </w:p>
+          <w:p>
+            <w:r>
+              <w:t xml:space="preserve">Record 3 changes: one space marked unavailable, one equipment item set to “under repair” and one equipment reservation. Note </w:t>
+            </w:r>
+            <w:r>
+              <w:lastRenderedPageBreak/>
+              <w:t xml:space="preserve">the time of each change. Ask a second staff member, who did not make the change, to check each one without being told what changed. </w:t>
+            </w:r>
+            <w:r>
+              <w:rPr>
+                <w:b/>
+                <w:bCs/>
+              </w:rPr>
+              <w:t>Pass if</w:t>
+            </w:r>
+            <w:r>
+              <w:t xml:space="preserve"> each change is visible to the second person within 1 working hour</w:t>
+            </w:r>
+            <w:r>
+              <w:t>.</w:t>
+            </w:r>
+          </w:p>
+        </w:tc>
+      </w:tr>
+      <w:tr>
+        <w:tc>
+          <w:tcPr>
+            <w:tcW w:w="2254" w:type="dxa"/>
+          </w:tcPr>
+          <w:p>
+            <w:r>
+              <w:lastRenderedPageBreak/>
+              <w:t>NFR3 -O</w:t>
+            </w:r>
+            <w:r>
+              <w:t xml:space="preserve">rganisational </w:t>
+            </w:r>
+            <w:r>
+              <w:t xml:space="preserve">and/or </w:t>
+            </w:r>
+            <w:r>
+              <w:t>payment information</w:t>
+            </w:r>
+            <w:r>
+              <w:t xml:space="preserve"> shall not appear in any information given to relief staff (A).</w:t>
+            </w:r>
+          </w:p>
+        </w:tc>
+        <w:tc>
+          <w:tcPr>
+            <w:tcW w:w="2254" w:type="dxa"/>
+          </w:tcPr>
+          <w:p>
+            <w:r>
+              <w:t xml:space="preserve">P8b; </w:t>
+            </w:r>
+          </w:p>
+          <w:p>
+            <w:r>
+              <w:t>R</w:t>
+            </w:r>
+            <w:r>
+              <w:t>elief staff must not see information they do not need.</w:t>
+            </w:r>
+          </w:p>
+        </w:tc>
+        <w:tc>
+          <w:tcPr>
+            <w:tcW w:w="2254" w:type="dxa"/>
+          </w:tcPr>
+          <w:p/>
+          <w:p>
+            <w:r>
+              <w:t>Must</w:t>
+            </w:r>
+          </w:p>
+        </w:tc>
+        <w:tc>
+          <w:tcPr>
+            <w:tcW w:w="2254" w:type="dxa"/>
+          </w:tcPr>
+          <w:p>
+            <w:r>
+              <w:t>Inspection:</w:t>
+            </w:r>
+          </w:p>
+          <w:p>
+            <w:r>
+              <w:t xml:space="preserve">Take </w:t>
+            </w:r>
+            <w:r>
+              <w:t>3</w:t>
+            </w:r>
+            <w:r>
+              <w:t xml:space="preserve"> sample bookings where the person opening differs from the booking contact. Collect </w:t>
+            </w:r>
+            <w:r>
+              <w:t xml:space="preserve">all information that was </w:t>
+            </w:r>
+            <w:r>
+              <w:t xml:space="preserve">given to relief staff for each booking. Check each item against a list of organisational and payment information. </w:t>
+            </w:r>
+            <w:r>
+              <w:rPr>
+                <w:b/>
+                <w:bCs/>
+              </w:rPr>
+              <w:t>Pass if</w:t>
+            </w:r>
+            <w:r>
+              <w:t xml:space="preserve"> none of the listed </w:t>
+            </w:r>
+            <w:r>
+              <w:t xml:space="preserve">information </w:t>
+            </w:r>
+            <w:r>
+              <w:t xml:space="preserve">appears </w:t>
+            </w:r>
+            <w:r>
+              <w:t>for any relief staff member</w:t>
+            </w:r>
+            <w:r>
+              <w:t>. The list must come from facility management</w:t>
+            </w:r>
+            <w:r>
+              <w:t>.</w:t>
+            </w:r>
+          </w:p>
+        </w:tc>
+      </w:tr>
+      <w:tr>
+        <w:tc>
+          <w:tcPr>
+            <w:tcW w:w="2254" w:type="dxa"/>
+          </w:tcPr>
+          <w:p>
+            <w:r>
+              <w:t xml:space="preserve">NFR4 - </w:t>
+            </w:r>
+            <w:r>
+              <w:t>The coordinator shall be able to compile a report from organised records for a 12-month period in under 30 minutes</w:t>
+            </w:r>
+            <w:r>
+              <w:t xml:space="preserve"> </w:t>
+            </w:r>
+            <w:r>
+              <w:t>(A)</w:t>
+            </w:r>
+            <w:r>
+              <w:t>.</w:t>
+            </w:r>
+          </w:p>
+        </w:tc>
+        <w:tc>
+          <w:tcPr>
+            <w:tcW w:w="2254" w:type="dxa"/>
+          </w:tcPr>
+          <w:tbl>
+            <w:tblPr>
+              <w:tblW w:w="0" w:type="auto"/>
+              <w:tblCellSpacing w:w="15" w:type="dxa"/>
+              <w:tblCellMar>
+                <w:top w:w="15" w:type="dxa"/>
+                <w:left w:w="15" w:type="dxa"/>
+                <w:bottom w:w="15" w:type="dxa"/>
+                <w:right w:w="15" w:type="dxa"/>
+              </w:tblCellMar>
+              <w:tblLook w:val="04A0" w:firstRow="1" w:lastRow="0" w:firstColumn="1" w:lastColumn="0" w:noHBand="0" w:noVBand="1"/>
+            </w:tblPr>
+            <w:tblGrid>
+              <w:gridCol w:w="1957"/>
+              <w:gridCol w:w="81"/>
+            </w:tblGrid>
+            <w:tr>
+              <w:trPr>
+                <w:tblCellSpacing w:w="15" w:type="dxa"/>
+              </w:trPr>
+              <w:tc>
+                <w:tcPr>
+                  <w:tcW w:w="0" w:type="auto"/>
+                  <w:vAlign w:val="center"/>
+                  <w:hideMark/>
+                </w:tcPr>
+                <w:p>
+                  <w:pPr>
+                    <w:spacing w:after="0" w:line="240" w:lineRule="auto"/>
+                    <w:rPr>
+                      <w:rFonts w:ascii="Times New Roman" w:eastAsia="Times New Roman" w:hAnsi="Times New Roman" w:cs="Times New Roman"/>
+                      <w:lang w:val="en-US" w:eastAsia="en-US"/>
+                    </w:rPr>
+                  </w:pPr>
+                  <w:r>
+                    <w:rPr>
+                      <w:rFonts w:ascii="Times New Roman" w:eastAsia="Times New Roman" w:hAnsi="Times New Roman" w:cs="Times New Roman"/>
+                      <w:lang w:val="en-US" w:eastAsia="en-US"/>
+                    </w:rPr>
+                    <w:t>P11; building report by hand is currently slow.</w:t>
+                  </w:r>
+                </w:p>
+              </w:tc>
+              <w:tc>
+                <w:tcPr>
+                  <w:tcW w:w="0" w:type="auto"/>
+                  <w:vAlign w:val="center"/>
+                  <w:hideMark/>
+                </w:tcPr>
+                <w:p>
+                  <w:pPr>
+                    <w:spacing w:after="0" w:line="240" w:lineRule="auto"/>
+                    <w:rPr>
+                      <w:rFonts w:ascii="Times New Roman" w:eastAsia="Times New Roman" w:hAnsi="Times New Roman" w:cs="Times New Roman"/>
+                      <w:lang w:val="en-US" w:eastAsia="en-US"/>
+                    </w:rPr>
+                  </w:pPr>
+                </w:p>
+              </w:tc>
+            </w:tr>
+          </w:tbl>
+          <w:p/>
+        </w:tc>
+        <w:tc>
+          <w:tcPr>
+            <w:tcW w:w="2254" w:type="dxa"/>
+          </w:tcPr>
+          <w:p/>
+          <w:p>
+            <w:r>
+              <w:t>Should</w:t>
+            </w:r>
+          </w:p>
+        </w:tc>
+        <w:tc>
+          <w:tcPr>
+            <w:tcW w:w="2254" w:type="dxa"/>
+          </w:tcPr>
+          <w:p>
+            <w:r>
+              <w:t>Timed task with coordinator:</w:t>
+            </w:r>
+          </w:p>
+          <w:p>
+            <w:r>
+              <w:t xml:space="preserve">Prepare sample records covering 12 months of bookings, maintenance conflicts, equipment allocation and </w:t>
+            </w:r>
+            <w:r>
+              <w:lastRenderedPageBreak/>
+              <w:t xml:space="preserve">incidents. Ask the coordinator to compile a report from the organised records only. Start the clock at the request and stop it when the coordinator hands over the finished report. </w:t>
+            </w:r>
+            <w:r>
+              <w:rPr>
+                <w:b/>
+                <w:bCs/>
+              </w:rPr>
+              <w:t>Pass if</w:t>
+            </w:r>
+            <w:r>
+              <w:t xml:space="preserve"> the time is under 30 minutes and the figures in the report match a manual count of the same sample.</w:t>
             </w:r>
           </w:p>
         </w:tc>

</xml_diff>